<commit_message>
chore: 项目更名为 crm-v1（同步 GitHub remote/文档链接/package-lock name，CloudBase 线上资源不受影响）
</commit_message>
<xml_diff>
--- a/docs/system-documentation.docx
+++ b/docs/system-documentation.docx
@@ -6414,7 +6414,7 @@
                 <w:sz w:val="18"/>
                 <w:szCs w:val="18"/>
               </w:rPr>
-              <w:t xml:space="preserve">https://github.com/VictorLiang2026/crm-cloudbase</w:t>
+              <w:t xml:space="preserve">https://github.com/VictorLiang2026/crm-v1</w:t>
             </w:r>
           </w:p>
         </w:tc>
@@ -8847,7 +8847,7 @@
           <w:sz w:val="20"/>
           <w:szCs w:val="20"/>
         </w:rPr>
-        <w:t xml:space="preserve">GitHub 仓库：https://github.com/VictorLiang2026/crm-cloudbase</w:t>
+        <w:t xml:space="preserve">GitHub 仓库：https://github.com/VictorLiang2026/crm-v1</w:t>
       </w:r>
     </w:p>
     <w:sectPr>

</xml_diff>